<commit_message>
vaaz: «Affetmek ve Öfkeyi Kontrol Etmek» gece sahnesi yenilendi, danışma hatları çıkarıldı
- «Gecenin affı» sahnesi yeniden üretildi (Higgsfield Nano Banana Pro 2K,
  sınırsız hak): eski görselde adam evde ayakkabılıydı ve dik diz çökmüştü.
  Yenisinde çoraplı, seccadede topukları üzerinde oturuyor, avuçları göğüs
  hizasında açık; alt metin buna göre güncellendi.
- Kullanıcı kararı: vaaz metni dışındaki danışma hattı numaraları
  kaldırıldı. Web'deki «Güvenlik önce gelir» kutusu, kaynakçadaki yardım
  hatları satırı ve kullanılmayan stilleri; Word/PDF kürsü nüshasının
  8. sayfasındaki aynı kutu. Vaazın kendi cümlesi yerinde kaldı.
- Word/PDF yeniden üretildi: 14 sayfa, 14 yer imi, yazım hatası 0.

Denetim: astro check 0 hata, design:check geçti; 6 görünümde taşma yok,
axe 0 ihlal, sayfada tel: bağlantısı ve numara 0, 63 dosya SHA-256 eşleşti.

Co-Authored-By: Claude Opus 5.5 <noreply@anthropic.com>
</commit_message>
<xml_diff>
--- a/public/vaazlar/affetmek-ve-ofkeyi-kontrol-etmek.docx
+++ b/public/vaazlar/affetmek-ve-ofkeyi-kontrol-etmek.docx
@@ -5520,222 +5520,6 @@
         <w:t>Bu yüzden aile içinde şiddet, tehdit, aşağılama veya istismar yaşayan bir kardeşimize «Sabret, affet, yuvanı dağıtma» deyip susmak affı yanlış yere koymaktır. Resûlullah eliyle hiçbir kadına ve hizmetçiye vurmamıştır. (Müslim, Fezâil, 79) Can, akıl ve onur emanettir; mağdurun güvenliği önce gelir. Yaşadığımız ülkedeki yardım hatlarına, uzmanlara ve hukukî yollara başvurmak dine aykırı değil, emaneti korumaktır.</w:t>
       </w:r>
     </w:p>
-    <w:tbl>
-      <w:tblPr>
-        <w:tblW w:type="auto" w:w="0"/>
-        <w:jc w:val="center"/>
-        <w:tblLayout w:type="fixed"/>
-        <w:tblLook w:firstColumn="1" w:firstRow="1" w:lastColumn="0" w:lastRow="0" w:noHBand="0" w:noVBand="1" w:val="04A0"/>
-      </w:tblPr>
-      <w:tblGrid>
-        <w:gridCol w:w="9602"/>
-      </w:tblGrid>
-      <w:tr>
-        <w:trPr>
-          <w:cantSplit/>
-        </w:trPr>
-        <w:tc>
-          <w:tcPr>
-            <w:tcW w:type="dxa" w:w="9602"/>
-            <w:shd w:val="clear" w:color="auto" w:fill="FDF7F7"/>
-            <w:tcBorders>
-              <w:top w:val="single" w:sz="4" w:space="0" w:color="E2E8F0"/>
-              <w:left w:val="single" w:sz="24" w:space="0" w:color="800020"/>
-              <w:bottom w:val="single" w:sz="6" w:space="0" w:color="CBD5E1"/>
-              <w:right w:val="single" w:sz="4" w:space="0" w:color="E2E8F0"/>
-            </w:tcBorders>
-            <w:tcMar>
-              <w:top w:w="70" w:type="dxa"/>
-              <w:left w:w="140" w:type="dxa"/>
-              <w:bottom w:w="75" w:type="dxa"/>
-              <w:right w:w="140" w:type="dxa"/>
-            </w:tcMar>
-          </w:tcPr>
-          <w:p>
-            <w:pPr>
-              <w:keepNext/>
-              <w:keepLines/>
-              <w:spacing w:before="20" w:after="40" w:line="252" w:lineRule="auto"/>
-              <w:pBdr>
-                <w:bottom w:val="single" w:sz="4" w:space="2" w:color="CBD5E1"/>
-              </w:pBdr>
-            </w:pPr>
-            <w:r>
-              <w:rPr>
-                <w:rFonts w:ascii="Calibri" w:hAnsi="Calibri" w:cs="Calibri" w:eastAsia="Calibri"/>
-                <w:b/>
-                <w:bCs/>
-                <w:color w:val="800020"/>
-                <w:sz w:val="18"/>
-                <w:szCs w:val="18"/>
-                <w:lang w:val="tr-TR" w:bidi="ar-SA"/>
-              </w:rPr>
-              <w:t>⚖️ FIKHÎ ÖLÇÜ VE İRŞAT REHBERİ</w:t>
-            </w:r>
-            <w:r>
-              <w:rPr>
-                <w:rFonts w:ascii="Calibri" w:hAnsi="Calibri" w:cs="Calibri" w:eastAsia="Calibri"/>
-                <w:noProof/>
-                <w:color w:val="646464"/>
-                <w:sz w:val="18"/>
-                <w:szCs w:val="18"/>
-                <w:lang w:val="tr-TR" w:bidi="ar-SA"/>
-              </w:rPr>
-              <w:t xml:space="preserve"> — </w:t>
-            </w:r>
-            <w:r>
-              <w:rPr>
-                <w:rFonts w:ascii="Calibri" w:hAnsi="Calibri" w:cs="Calibri" w:eastAsia="Calibri"/>
-                <w:b/>
-                <w:bCs/>
-                <w:color w:val="141414"/>
-                <w:sz w:val="20"/>
-                <w:szCs w:val="20"/>
-                <w:lang w:val="tr-TR" w:bidi="ar-SA"/>
-              </w:rPr>
-              <w:t>Güvenlik önce gelir</w:t>
-            </w:r>
-          </w:p>
-          <w:p>
-            <w:pPr>
-              <w:keepNext w:val="0"/>
-              <w:keepLines/>
-              <w:spacing w:before="20" w:after="30" w:line="269" w:lineRule="auto"/>
-              <w:jc w:val="both"/>
-            </w:pPr>
-            <w:r>
-              <w:rPr>
-                <w:rFonts w:ascii="Calibri" w:hAnsi="Calibri" w:cs="Calibri" w:eastAsia="Calibri"/>
-                <w:color w:val="222222"/>
-                <w:sz w:val="20"/>
-                <w:szCs w:val="20"/>
-                <w:lang w:val="tr-TR" w:bidi="ar-SA"/>
-              </w:rPr>
-              <w:t xml:space="preserve">Belçika’da gizli ve ücretsiz danışma hatları: </w:t>
-            </w:r>
-            <w:r>
-              <w:rPr>
-                <w:rFonts w:ascii="Calibri" w:hAnsi="Calibri" w:cs="Calibri" w:eastAsia="Calibri"/>
-                <w:b/>
-                <w:bCs/>
-                <w:noProof/>
-                <w:color w:val="141414"/>
-                <w:sz w:val="20"/>
-                <w:szCs w:val="20"/>
-                <w:lang w:val="tr-TR" w:bidi="ar-SA"/>
-              </w:rPr>
-              <w:t>0800 30 030</w:t>
-            </w:r>
-            <w:r>
-              <w:rPr>
-                <w:rFonts w:ascii="Calibri" w:hAnsi="Calibri" w:cs="Calibri" w:eastAsia="Calibri"/>
-                <w:color w:val="222222"/>
-                <w:sz w:val="20"/>
-                <w:szCs w:val="20"/>
-                <w:lang w:val="tr-TR" w:bidi="ar-SA"/>
-              </w:rPr>
-              <w:t xml:space="preserve"> (Fransızca konuşulan bölge) ve </w:t>
-            </w:r>
-            <w:r>
-              <w:rPr>
-                <w:rFonts w:ascii="Calibri" w:hAnsi="Calibri" w:cs="Calibri" w:eastAsia="Calibri"/>
-                <w:b/>
-                <w:bCs/>
-                <w:noProof/>
-                <w:color w:val="141414"/>
-                <w:sz w:val="20"/>
-                <w:szCs w:val="20"/>
-                <w:lang w:val="tr-TR" w:bidi="ar-SA"/>
-              </w:rPr>
-              <w:t>1712</w:t>
-            </w:r>
-            <w:r>
-              <w:rPr>
-                <w:rFonts w:ascii="Calibri" w:hAnsi="Calibri" w:cs="Calibri" w:eastAsia="Calibri"/>
-                <w:color w:val="222222"/>
-                <w:sz w:val="20"/>
-                <w:szCs w:val="20"/>
-                <w:lang w:val="tr-TR" w:bidi="ar-SA"/>
-              </w:rPr>
-              <w:t xml:space="preserve"> (Flaman bölgesi). Bu hatlar acil durum numarası değildir; hayati tehlikede </w:t>
-            </w:r>
-            <w:r>
-              <w:rPr>
-                <w:rFonts w:ascii="Calibri" w:hAnsi="Calibri" w:cs="Calibri" w:eastAsia="Calibri"/>
-                <w:b/>
-                <w:bCs/>
-                <w:noProof/>
-                <w:color w:val="141414"/>
-                <w:sz w:val="20"/>
-                <w:szCs w:val="20"/>
-                <w:lang w:val="tr-TR" w:bidi="ar-SA"/>
-              </w:rPr>
-              <w:t>112</w:t>
-            </w:r>
-            <w:r>
-              <w:rPr>
-                <w:rFonts w:ascii="Calibri" w:hAnsi="Calibri" w:cs="Calibri" w:eastAsia="Calibri"/>
-                <w:color w:val="222222"/>
-                <w:sz w:val="20"/>
-                <w:szCs w:val="20"/>
-                <w:lang w:val="tr-TR" w:bidi="ar-SA"/>
-              </w:rPr>
-              <w:t xml:space="preserve">, polis için </w:t>
-            </w:r>
-            <w:r>
-              <w:rPr>
-                <w:rFonts w:ascii="Calibri" w:hAnsi="Calibri" w:cs="Calibri" w:eastAsia="Calibri"/>
-                <w:b/>
-                <w:bCs/>
-                <w:noProof/>
-                <w:color w:val="141414"/>
-                <w:sz w:val="20"/>
-                <w:szCs w:val="20"/>
-                <w:lang w:val="tr-TR" w:bidi="ar-SA"/>
-              </w:rPr>
-              <w:t>101</w:t>
-            </w:r>
-            <w:r>
-              <w:rPr>
-                <w:rFonts w:ascii="Calibri" w:hAnsi="Calibri" w:cs="Calibri" w:eastAsia="Calibri"/>
-                <w:color w:val="222222"/>
-                <w:sz w:val="20"/>
-                <w:szCs w:val="20"/>
-                <w:lang w:val="tr-TR" w:bidi="ar-SA"/>
-              </w:rPr>
-              <w:t xml:space="preserve"> aranır.</w:t>
-            </w:r>
-          </w:p>
-          <w:p>
-            <w:pPr>
-              <w:keepNext w:val="0"/>
-              <w:keepLines/>
-              <w:spacing w:before="20" w:after="10" w:line="240" w:lineRule="auto"/>
-              <w:jc w:val="right"/>
-            </w:pPr>
-            <w:r>
-              <w:rPr>
-                <w:rFonts w:ascii="Calibri" w:hAnsi="Calibri" w:cs="Calibri" w:eastAsia="Calibri"/>
-                <w:b/>
-                <w:bCs/>
-                <w:color w:val="475569"/>
-                <w:sz w:val="17"/>
-                <w:szCs w:val="17"/>
-                <w:lang w:val="tr-TR" w:bidi="ar-SA"/>
-              </w:rPr>
-              <w:t>[Hatlar 8 Ekim 2026’da resmî sayfalardan doğrulanmıştır]</w:t>
-            </w:r>
-          </w:p>
-        </w:tc>
-      </w:tr>
-    </w:tbl>
-    <w:p>
-      <w:pPr>
-        <w:keepNext w:val="0"/>
-        <w:keepLines/>
-        <w:spacing w:before="0" w:after="60" w:line="240" w:lineRule="auto"/>
-      </w:pPr>
-    </w:p>
     <w:p>
       <w:pPr>
         <w:keepNext w:val="0"/>

</xml_diff>